<commit_message>
added some gilab comments
</commit_message>
<xml_diff>
--- a/chatgpt links.docx
+++ b/chatgpt links.docx
@@ -3,11 +3,9 @@
 <w:document xmlns:wpc="http://schemas.microsoft.com/office/word/2010/wordprocessingCanvas" xmlns:mc="http://schemas.openxmlformats.org/markup-compatibility/2006" xmlns:o="urn:schemas-microsoft-com:office:office" xmlns:r="http://schemas.openxmlformats.org/officeDocument/2006/relationships" xmlns:m="http://schemas.openxmlformats.org/officeDocument/2006/math" xmlns:v="urn:schemas-microsoft-com:vml" xmlns:wp14="http://schemas.microsoft.com/office/word/2010/wordprocessingDrawing" xmlns:wp="http://schemas.openxmlformats.org/drawingml/2006/wordprocessingDrawing" xmlns:w10="urn:schemas-microsoft-com:office:word" xmlns:w="http://schemas.openxmlformats.org/wordprocessingml/2006/main" xmlns:w14="http://schemas.microsoft.com/office/word/2010/wordml" xmlns:wpg="http://schemas.microsoft.com/office/word/2010/wordprocessingGroup" xmlns:wpi="http://schemas.microsoft.com/office/word/2010/wordprocessingInk" xmlns:wne="http://schemas.microsoft.com/office/word/2006/wordml" xmlns:wps="http://schemas.microsoft.com/office/word/2010/wordprocessingShape" mc:Ignorable="w14 wp14">
   <w:body>
     <w:p>
-      <w:proofErr w:type="spellStart"/>
       <w:r>
         <w:t>Js</w:t>
       </w:r>
-      <w:proofErr w:type="spellEnd"/>
     </w:p>
     <w:p>
       <w:hyperlink r:id="rId5" w:history="1">
@@ -21,11 +19,9 @@
     </w:p>
     <w:p/>
     <w:p>
-      <w:proofErr w:type="gramStart"/>
       <w:r>
         <w:t>typescript</w:t>
       </w:r>
-      <w:proofErr w:type="gramEnd"/>
     </w:p>
     <w:p>
       <w:hyperlink r:id="rId6" w:history="1">
@@ -68,13 +64,8 @@
           <w:tab w:val="left" w:pos="6660"/>
         </w:tabs>
       </w:pPr>
-      <w:proofErr w:type="gramStart"/>
       <w:r>
-        <w:t>oops</w:t>
-      </w:r>
-      <w:proofErr w:type="gramEnd"/>
-      <w:r>
-        <w:t xml:space="preserve"> in typescript</w:t>
+        <w:t>oops in typescript</w:t>
       </w:r>
     </w:p>
     <w:p>
@@ -100,13 +91,8 @@
       </w:pPr>
     </w:p>
     <w:p>
-      <w:proofErr w:type="spellStart"/>
       <w:r>
-        <w:t>Tekpyramid</w:t>
-      </w:r>
-      <w:proofErr w:type="spellEnd"/>
-      <w:r>
-        <w:t xml:space="preserve"> next.js</w:t>
+        <w:t>Tekpyramid next.js</w:t>
       </w:r>
     </w:p>
     <w:p>
@@ -133,11 +119,9 @@
           <w:tab w:val="left" w:pos="6405"/>
         </w:tabs>
       </w:pPr>
-      <w:proofErr w:type="gramStart"/>
       <w:r>
         <w:t>rendering</w:t>
       </w:r>
-      <w:proofErr w:type="gramEnd"/>
     </w:p>
     <w:p>
       <w:pPr>
@@ -167,13 +151,8 @@
           <w:tab w:val="left" w:pos="6405"/>
         </w:tabs>
       </w:pPr>
-      <w:proofErr w:type="gramStart"/>
       <w:r>
-        <w:t>react</w:t>
-      </w:r>
-      <w:proofErr w:type="gramEnd"/>
-      <w:r>
-        <w:t xml:space="preserve"> question and answer for interview</w:t>
+        <w:t>react question and answer for interview</w:t>
       </w:r>
     </w:p>
     <w:p>
@@ -239,21 +218,9 @@
           <w:tab w:val="left" w:pos="6405"/>
         </w:tabs>
       </w:pPr>
-      <w:proofErr w:type="spellStart"/>
-      <w:proofErr w:type="gramStart"/>
       <w:r>
-        <w:t>Talwind</w:t>
+        <w:t>Talwind  css</w:t>
       </w:r>
-      <w:proofErr w:type="spellEnd"/>
-      <w:r>
-        <w:t xml:space="preserve">  </w:t>
-      </w:r>
-      <w:proofErr w:type="spellStart"/>
-      <w:r>
-        <w:t>css</w:t>
-      </w:r>
-      <w:proofErr w:type="spellEnd"/>
-      <w:proofErr w:type="gramEnd"/>
     </w:p>
     <w:p>
       <w:pPr>
@@ -276,132 +243,8 @@
         <w:tabs>
           <w:tab w:val="left" w:pos="6405"/>
         </w:tabs>
-      </w:pPr>
-      <w:proofErr w:type="gramStart"/>
-      <w:r>
-        <w:t>react</w:t>
-      </w:r>
-      <w:proofErr w:type="gramEnd"/>
-      <w:r>
-        <w:t xml:space="preserve"> library</w:t>
-      </w:r>
-    </w:p>
-    <w:p>
-      <w:pPr>
-        <w:tabs>
-          <w:tab w:val="left" w:pos="6405"/>
-        </w:tabs>
         <w:rPr>
           <w:rStyle w:val="Hyperlink"/>
-        </w:rPr>
-      </w:pPr>
-      <w:hyperlink r:id="rId14" w:history="1">
-        <w:r>
-          <w:rPr>
-            <w:rStyle w:val="Hyperlink"/>
-          </w:rPr>
-          <w:t>https://chatgpt.com/share/690449c4-f54c-8013-a096-df3373a3b48e</w:t>
-        </w:r>
-      </w:hyperlink>
-    </w:p>
-    <w:p>
-      <w:pPr>
-        <w:tabs>
-          <w:tab w:val="left" w:pos="6405"/>
-        </w:tabs>
-      </w:pPr>
-      <w:proofErr w:type="spellStart"/>
-      <w:proofErr w:type="gramStart"/>
-      <w:r>
-        <w:t>mern</w:t>
-      </w:r>
-      <w:proofErr w:type="spellEnd"/>
-      <w:proofErr w:type="gramEnd"/>
-      <w:r>
-        <w:t xml:space="preserve"> setup</w:t>
-      </w:r>
-    </w:p>
-    <w:p>
-      <w:pPr>
-        <w:tabs>
-          <w:tab w:val="left" w:pos="6405"/>
-        </w:tabs>
-      </w:pPr>
-      <w:hyperlink r:id="rId15" w:history="1">
-        <w:r>
-          <w:rPr>
-            <w:rStyle w:val="Hyperlink"/>
-          </w:rPr>
-          <w:t>https://chatgpt.com/share/69131628-5294-8013-bd60-aaa80806ed26</w:t>
-        </w:r>
-      </w:hyperlink>
-    </w:p>
-    <w:p>
-      <w:pPr>
-        <w:tabs>
-          <w:tab w:val="left" w:pos="6405"/>
-        </w:tabs>
-      </w:pPr>
-      <w:bookmarkStart w:id="0" w:name="_GoBack"/>
-      <w:bookmarkEnd w:id="0"/>
-    </w:p>
-    <w:p>
-      <w:pPr>
-        <w:tabs>
-          <w:tab w:val="left" w:pos="6405"/>
-        </w:tabs>
-        <w:rPr>
-          <w:rStyle w:val="Hyperlink"/>
-        </w:rPr>
-      </w:pPr>
-    </w:p>
-    <w:p>
-      <w:pPr>
-        <w:tabs>
-          <w:tab w:val="left" w:pos="6405"/>
-        </w:tabs>
-        <w:rPr>
-          <w:rStyle w:val="Hyperlink"/>
-        </w:rPr>
-      </w:pPr>
-    </w:p>
-    <w:p>
-      <w:pPr>
-        <w:tabs>
-          <w:tab w:val="left" w:pos="6405"/>
-        </w:tabs>
-        <w:rPr>
-          <w:rStyle w:val="Hyperlink"/>
-        </w:rPr>
-      </w:pPr>
-    </w:p>
-    <w:p>
-      <w:pPr>
-        <w:shd w:val="clear" w:color="auto" w:fill="FFFFFF"/>
-        <w:rPr>
-          <w:rFonts w:ascii="Segoe UI" w:hAnsi="Segoe UI" w:cs="Segoe UI"/>
-          <w:color w:val="1F4E79"/>
-          <w:shd w:val="clear" w:color="auto" w:fill="FFFFFF"/>
-        </w:rPr>
-      </w:pPr>
-    </w:p>
-    <w:p>
-      <w:pPr>
-        <w:shd w:val="clear" w:color="auto" w:fill="FFFFFF"/>
-        <w:rPr>
-          <w:rFonts w:ascii="Segoe UI" w:hAnsi="Segoe UI" w:cs="Segoe UI"/>
-          <w:color w:val="1F4E79"/>
-          <w:shd w:val="clear" w:color="auto" w:fill="FFFFFF"/>
-        </w:rPr>
-      </w:pPr>
-    </w:p>
-    <w:p>
-      <w:pPr>
-        <w:shd w:val="clear" w:color="auto" w:fill="FFFFFF"/>
-        <w:rPr>
-          <w:rFonts w:ascii="Segoe UI" w:hAnsi="Segoe UI" w:cs="Segoe UI"/>
-          <w:color w:val="1F4E79"/>
-          <w:shd w:val="clear" w:color="auto" w:fill="FFFFFF"/>
         </w:rPr>
       </w:pPr>
     </w:p>
@@ -429,7 +272,7 @@
         </w:rPr>
         <w:t> </w:t>
       </w:r>
-      <w:hyperlink r:id="rId16" w:tgtFrame="_blank" w:history="1">
+      <w:hyperlink r:id="rId14" w:tgtFrame="_blank" w:history="1">
         <w:r>
           <w:rPr>
             <w:rStyle w:val="Hyperlink"/>
@@ -754,31 +597,13 @@
                 <w:szCs w:val="24"/>
               </w:rPr>
             </w:pPr>
-            <w:proofErr w:type="spellStart"/>
             <w:r>
               <w:rPr>
                 <w:rFonts w:ascii="Bahnschrift SemiCondensed" w:hAnsi="Bahnschrift SemiCondensed"/>
                 <w:color w:val="000000"/>
               </w:rPr>
-              <w:t>Pankaj</w:t>
+              <w:t>Pankaj Kumar Sunil kumar</w:t>
             </w:r>
-            <w:proofErr w:type="spellEnd"/>
-            <w:r>
-              <w:rPr>
-                <w:rFonts w:ascii="Bahnschrift SemiCondensed" w:hAnsi="Bahnschrift SemiCondensed"/>
-                <w:color w:val="000000"/>
-              </w:rPr>
-              <w:t xml:space="preserve"> Kumar Sunil </w:t>
-            </w:r>
-            <w:proofErr w:type="spellStart"/>
-            <w:r>
-              <w:rPr>
-                <w:rFonts w:ascii="Bahnschrift SemiCondensed" w:hAnsi="Bahnschrift SemiCondensed"/>
-                <w:color w:val="000000"/>
-              </w:rPr>
-              <w:t>kumar</w:t>
-            </w:r>
-            <w:proofErr w:type="spellEnd"/>
           </w:p>
         </w:tc>
         <w:tc>
@@ -846,7 +671,7 @@
                 <w:szCs w:val="24"/>
               </w:rPr>
             </w:pPr>
-            <w:hyperlink r:id="rId17" w:tgtFrame="_blank" w:history="1">
+            <w:hyperlink r:id="rId15" w:tgtFrame="_blank" w:history="1">
               <w:r>
                 <w:rPr>
                   <w:rStyle w:val="Hyperlink"/>
@@ -887,7 +712,7 @@
                 <w:szCs w:val="24"/>
               </w:rPr>
             </w:pPr>
-            <w:hyperlink r:id="rId18" w:tgtFrame="_blank" w:history="1">
+            <w:hyperlink r:id="rId16" w:tgtFrame="_blank" w:history="1">
               <w:r>
                 <w:rPr>
                   <w:rStyle w:val="Hyperlink"/>
@@ -953,8 +778,11 @@
         </w:tabs>
       </w:pPr>
       <w:r>
-        <w:t>Add to cart</w:t>
+        <w:lastRenderedPageBreak/>
+        <w:t>jira</w:t>
       </w:r>
+      <w:bookmarkStart w:id="0" w:name="_GoBack"/>
+      <w:bookmarkEnd w:id="0"/>
     </w:p>
     <w:p>
       <w:pPr>
@@ -962,14 +790,9 @@
           <w:tab w:val="left" w:pos="6405"/>
         </w:tabs>
       </w:pPr>
-      <w:hyperlink r:id="rId19" w:history="1">
-        <w:r>
-          <w:rPr>
-            <w:rStyle w:val="Hyperlink"/>
-          </w:rPr>
-          <w:t>https://chatgpt.com/share/68f4788c-c0b4-8013-b742-9fe37d36e328</w:t>
-        </w:r>
-      </w:hyperlink>
+      <w:r>
+        <w:t>pankaj kumar</w:t>
+      </w:r>
     </w:p>
     <w:p>
       <w:pPr>
@@ -977,6 +800,9 @@
           <w:tab w:val="left" w:pos="6405"/>
         </w:tabs>
       </w:pPr>
+      <w:r>
+        <w:t>Pankaj&amp;5Fv4ed3</w:t>
+      </w:r>
     </w:p>
     <w:p>
       <w:pPr>

</xml_diff>